<commit_message>
Update Lista 2 - correção exercicios 11-15.docx
</commit_message>
<xml_diff>
--- a/Curso_Em_JAVA/Aula 5/exercicios/Lista 2 - correção exercicios 11-15.docx
+++ b/Curso_Em_JAVA/Aula 5/exercicios/Lista 2 - correção exercicios 11-15.docx
@@ -21,14 +21,14 @@
           <w:sz w:val="32"/>
           <w:szCs w:val="32"/>
         </w:rPr>
-        <w:t xml:space="preserve"> </w:t>
+        <w:t xml:space="preserve"> 02</w:t>
       </w:r>
       <w:r>
         <w:rPr>
           <w:sz w:val="32"/>
           <w:szCs w:val="32"/>
         </w:rPr>
-        <w:t>02</w:t>
+        <w:t xml:space="preserve"> Aula 5</w:t>
       </w:r>
       <w:r>
         <w:rPr>

</xml_diff>